<commit_message>
Add code listings and demo screenshots to report
</commit_message>
<xml_diff>
--- a/docs/ABC_Technologies_Customer_Support_Automation_Report.docx
+++ b/docs/ABC_Technologies_Customer_Support_Automation_Report.docx
@@ -1419,6 +1419,925 @@
         <w:rPr>
           <w:color w:val="1F4E79"/>
         </w:rPr>
+        <w:t>Input and Output Screenshots</w:t>
+      </w:r>
+    </w:p>
+    <w:p>
+      <w:r>
+        <w:t>The following screenshots show the actual demo execution for each required sample query, including input, route, approval status, trace, retrieved context, and final response.</w:t>
+      </w:r>
+    </w:p>
+    <w:p>
+      <w:r>
+        <w:t>Query 1 execution screenshot</w:t>
+      </w:r>
+    </w:p>
+    <w:p>
+      <w:r>
+        <w:drawing>
+          <wp:inline xmlns:a="http://schemas.openxmlformats.org/drawingml/2006/main" xmlns:pic="http://schemas.openxmlformats.org/drawingml/2006/picture">
+            <wp:extent cx="6217920" cy="4352544"/>
+            <wp:docPr id="2" name="Picture 2"/>
+            <wp:cNvGraphicFramePr>
+              <a:graphicFrameLocks noChangeAspect="1"/>
+            </wp:cNvGraphicFramePr>
+            <a:graphic>
+              <a:graphicData uri="http://schemas.openxmlformats.org/drawingml/2006/picture">
+                <pic:pic>
+                  <pic:nvPicPr>
+                    <pic:cNvPr id="0" name="demo_query_1_screenshot.png"/>
+                    <pic:cNvPicPr/>
+                  </pic:nvPicPr>
+                  <pic:blipFill>
+                    <a:blip r:embed="rId10"/>
+                    <a:stretch>
+                      <a:fillRect/>
+                    </a:stretch>
+                  </pic:blipFill>
+                  <pic:spPr>
+                    <a:xfrm>
+                      <a:off x="0" y="0"/>
+                      <a:ext cx="6217920" cy="4352544"/>
+                    </a:xfrm>
+                    <a:prstGeom prst="rect"/>
+                  </pic:spPr>
+                </pic:pic>
+              </a:graphicData>
+            </a:graphic>
+          </wp:inline>
+        </w:drawing>
+      </w:r>
+    </w:p>
+    <w:p>
+      <w:r>
+        <w:t>Query 2 execution screenshot</w:t>
+      </w:r>
+    </w:p>
+    <w:p>
+      <w:r>
+        <w:drawing>
+          <wp:inline xmlns:a="http://schemas.openxmlformats.org/drawingml/2006/main" xmlns:pic="http://schemas.openxmlformats.org/drawingml/2006/picture">
+            <wp:extent cx="6217920" cy="4352544"/>
+            <wp:docPr id="3" name="Picture 3"/>
+            <wp:cNvGraphicFramePr>
+              <a:graphicFrameLocks noChangeAspect="1"/>
+            </wp:cNvGraphicFramePr>
+            <a:graphic>
+              <a:graphicData uri="http://schemas.openxmlformats.org/drawingml/2006/picture">
+                <pic:pic>
+                  <pic:nvPicPr>
+                    <pic:cNvPr id="0" name="demo_query_2_screenshot.png"/>
+                    <pic:cNvPicPr/>
+                  </pic:nvPicPr>
+                  <pic:blipFill>
+                    <a:blip r:embed="rId11"/>
+                    <a:stretch>
+                      <a:fillRect/>
+                    </a:stretch>
+                  </pic:blipFill>
+                  <pic:spPr>
+                    <a:xfrm>
+                      <a:off x="0" y="0"/>
+                      <a:ext cx="6217920" cy="4352544"/>
+                    </a:xfrm>
+                    <a:prstGeom prst="rect"/>
+                  </pic:spPr>
+                </pic:pic>
+              </a:graphicData>
+            </a:graphic>
+          </wp:inline>
+        </w:drawing>
+      </w:r>
+    </w:p>
+    <w:p>
+      <w:r>
+        <w:t>Query 3 execution screenshot</w:t>
+      </w:r>
+    </w:p>
+    <w:p>
+      <w:r>
+        <w:drawing>
+          <wp:inline xmlns:a="http://schemas.openxmlformats.org/drawingml/2006/main" xmlns:pic="http://schemas.openxmlformats.org/drawingml/2006/picture">
+            <wp:extent cx="6217920" cy="4352544"/>
+            <wp:docPr id="4" name="Picture 4"/>
+            <wp:cNvGraphicFramePr>
+              <a:graphicFrameLocks noChangeAspect="1"/>
+            </wp:cNvGraphicFramePr>
+            <a:graphic>
+              <a:graphicData uri="http://schemas.openxmlformats.org/drawingml/2006/picture">
+                <pic:pic>
+                  <pic:nvPicPr>
+                    <pic:cNvPr id="0" name="demo_query_3_screenshot.png"/>
+                    <pic:cNvPicPr/>
+                  </pic:nvPicPr>
+                  <pic:blipFill>
+                    <a:blip r:embed="rId12"/>
+                    <a:stretch>
+                      <a:fillRect/>
+                    </a:stretch>
+                  </pic:blipFill>
+                  <pic:spPr>
+                    <a:xfrm>
+                      <a:off x="0" y="0"/>
+                      <a:ext cx="6217920" cy="4352544"/>
+                    </a:xfrm>
+                    <a:prstGeom prst="rect"/>
+                  </pic:spPr>
+                </pic:pic>
+              </a:graphicData>
+            </a:graphic>
+          </wp:inline>
+        </w:drawing>
+      </w:r>
+    </w:p>
+    <w:p>
+      <w:r>
+        <w:t>Query 4 execution screenshot</w:t>
+      </w:r>
+    </w:p>
+    <w:p>
+      <w:r>
+        <w:drawing>
+          <wp:inline xmlns:a="http://schemas.openxmlformats.org/drawingml/2006/main" xmlns:pic="http://schemas.openxmlformats.org/drawingml/2006/picture">
+            <wp:extent cx="6217920" cy="4352544"/>
+            <wp:docPr id="5" name="Picture 5"/>
+            <wp:cNvGraphicFramePr>
+              <a:graphicFrameLocks noChangeAspect="1"/>
+            </wp:cNvGraphicFramePr>
+            <a:graphic>
+              <a:graphicData uri="http://schemas.openxmlformats.org/drawingml/2006/picture">
+                <pic:pic>
+                  <pic:nvPicPr>
+                    <pic:cNvPr id="0" name="demo_query_4_screenshot.png"/>
+                    <pic:cNvPicPr/>
+                  </pic:nvPicPr>
+                  <pic:blipFill>
+                    <a:blip r:embed="rId13"/>
+                    <a:stretch>
+                      <a:fillRect/>
+                    </a:stretch>
+                  </pic:blipFill>
+                  <pic:spPr>
+                    <a:xfrm>
+                      <a:off x="0" y="0"/>
+                      <a:ext cx="6217920" cy="4352544"/>
+                    </a:xfrm>
+                    <a:prstGeom prst="rect"/>
+                  </pic:spPr>
+                </pic:pic>
+              </a:graphicData>
+            </a:graphic>
+          </wp:inline>
+        </w:drawing>
+      </w:r>
+    </w:p>
+    <w:p>
+      <w:r>
+        <w:t>Query 5 execution screenshot</w:t>
+      </w:r>
+    </w:p>
+    <w:p>
+      <w:r>
+        <w:drawing>
+          <wp:inline xmlns:a="http://schemas.openxmlformats.org/drawingml/2006/main" xmlns:pic="http://schemas.openxmlformats.org/drawingml/2006/picture">
+            <wp:extent cx="6217920" cy="4352544"/>
+            <wp:docPr id="6" name="Picture 6"/>
+            <wp:cNvGraphicFramePr>
+              <a:graphicFrameLocks noChangeAspect="1"/>
+            </wp:cNvGraphicFramePr>
+            <a:graphic>
+              <a:graphicData uri="http://schemas.openxmlformats.org/drawingml/2006/picture">
+                <pic:pic>
+                  <pic:nvPicPr>
+                    <pic:cNvPr id="0" name="demo_query_5_screenshot.png"/>
+                    <pic:cNvPicPr/>
+                  </pic:nvPicPr>
+                  <pic:blipFill>
+                    <a:blip r:embed="rId14"/>
+                    <a:stretch>
+                      <a:fillRect/>
+                    </a:stretch>
+                  </pic:blipFill>
+                  <pic:spPr>
+                    <a:xfrm>
+                      <a:off x="0" y="0"/>
+                      <a:ext cx="6217920" cy="4352544"/>
+                    </a:xfrm>
+                    <a:prstGeom prst="rect"/>
+                  </pic:spPr>
+                </pic:pic>
+              </a:graphicData>
+            </a:graphic>
+          </wp:inline>
+        </w:drawing>
+      </w:r>
+    </w:p>
+    <w:p>
+      <w:pPr>
+        <w:pStyle w:val="Heading1"/>
+      </w:pPr>
+      <w:r>
+        <w:rPr>
+          <w:color w:val="1F4E79"/>
+        </w:rPr>
+        <w:t>Source Code</w:t>
+      </w:r>
+    </w:p>
+    <w:p>
+      <w:pPr>
+        <w:pStyle w:val="Heading2"/>
+      </w:pPr>
+      <w:r>
+        <w:rPr>
+          <w:color w:val="1F4E79"/>
+        </w:rPr>
+        <w:t>Main LangGraph Workflow Code</w:t>
+      </w:r>
+    </w:p>
+    <w:p>
+      <w:pPr>
+        <w:spacing w:after="160"/>
+      </w:pPr>
+      <w:r>
+        <w:rPr>
+          <w:rFonts w:ascii="Consolas" w:hAnsi="Consolas"/>
+          <w:sz w:val="16"/>
+        </w:rPr>
+        <w:t>from __future__ import annotations</w:t>
+        <w:br/>
+        <w:br/>
+        <w:t>import re</w:t>
+        <w:br/>
+        <w:t>import sqlite3</w:t>
+        <w:br/>
+        <w:t>from dataclasses import dataclass</w:t>
+        <w:br/>
+        <w:t>from pathlib import Path</w:t>
+        <w:br/>
+        <w:t>from typing import Literal, TypedDict</w:t>
+        <w:br/>
+        <w:br/>
+        <w:t>try:</w:t>
+        <w:br/>
+        <w:t xml:space="preserve">    from langgraph.graph import END, StateGraph</w:t>
+        <w:br/>
+        <w:t>except Exception as exc:  # pragma: no cover</w:t>
+        <w:br/>
+        <w:t xml:space="preserve">    raise RuntimeError("LangGraph is required. Install dependencies with: pip install -r requirements.txt") from exc</w:t>
+        <w:br/>
+        <w:br/>
+        <w:br/>
+        <w:t>Department = Literal["Sales", "Technical Support", "Billing", "Account", "Memory Recall"]</w:t>
+        <w:br/>
+        <w:br/>
+        <w:t>HIGH_RISK_PATTERNS = [</w:t>
+        <w:br/>
+        <w:t xml:space="preserve">    "refund",</w:t>
+        <w:br/>
+        <w:t xml:space="preserve">    "cancel",</w:t>
+        <w:br/>
+        <w:t xml:space="preserve">    "cancellation",</w:t>
+        <w:br/>
+        <w:t xml:space="preserve">    "close account",</w:t>
+        <w:br/>
+        <w:t xml:space="preserve">    "account closure",</w:t>
+        <w:br/>
+        <w:t xml:space="preserve">    "delete my account",</w:t>
+        <w:br/>
+        <w:t xml:space="preserve">    "compensation",</w:t>
+        <w:br/>
+        <w:t xml:space="preserve">    "escalate",</w:t>
+        <w:br/>
+        <w:t xml:space="preserve">    "management",</w:t>
+        <w:br/>
+        <w:t>]</w:t>
+        <w:br/>
+        <w:br/>
+        <w:t>DEPARTMENT_KEYWORDS = {</w:t>
+        <w:br/>
+        <w:t xml:space="preserve">    "Sales": ["pricing", "plans", "subscription plan", "price", "product information", "features"],</w:t>
+        <w:br/>
+        <w:t xml:space="preserve">    "Technical Support": ["crash", "error", "install", "installation", "login", "configuration", "upload", "bug"],</w:t>
+        <w:br/>
+        <w:t xml:space="preserve">    "Billing": ["invoice", "payment", "billing", "refund", "charge", "annual subscription"],</w:t>
+        <w:br/>
+        <w:t xml:space="preserve">    "Account": ["password", "profile", "account activation", "deactivation", "activate", "reset"],</w:t>
+        <w:br/>
+        <w:t>}</w:t>
+        <w:br/>
+        <w:br/>
+        <w:br/>
+        <w:t>class SupportState(TypedDict, total=False):</w:t>
+        <w:br/>
+        <w:t xml:space="preserve">    customer_id: str</w:t>
+        <w:br/>
+        <w:t xml:space="preserve">    query: str</w:t>
+        <w:br/>
+        <w:t xml:space="preserve">    intent: Department</w:t>
+        <w:br/>
+        <w:t xml:space="preserve">    routed_department: str</w:t>
+        <w:br/>
+        <w:t xml:space="preserve">    retrieved_context: list[str]</w:t>
+        <w:br/>
+        <w:t xml:space="preserve">    conversation_history: list[str]</w:t>
+        <w:br/>
+        <w:t xml:space="preserve">    high_risk: bool</w:t>
+        <w:br/>
+        <w:t xml:space="preserve">    approval_required: bool</w:t>
+        <w:br/>
+        <w:t xml:space="preserve">    approval_status: str</w:t>
+        <w:br/>
+        <w:t xml:space="preserve">    draft_response: str</w:t>
+        <w:br/>
+        <w:t xml:space="preserve">    final_response: str</w:t>
+        <w:br/>
+        <w:t xml:space="preserve">    trace: list[str]</w:t>
+        <w:br/>
+        <w:br/>
+        <w:br/>
+        <w:t>@dataclass</w:t>
+        <w:br/>
+        <w:t>class RetrievedDocument:</w:t>
+        <w:br/>
+        <w:t xml:space="preserve">    source: str</w:t>
+        <w:br/>
+        <w:t xml:space="preserve">    text: str</w:t>
+        <w:br/>
+        <w:t xml:space="preserve">    score: int</w:t>
+        <w:br/>
+        <w:br/>
+        <w:br/>
+        <w:t>class SQLiteMemory:</w:t>
+        <w:br/>
+        <w:t xml:space="preserve">    def __init__(self, db_path: Path) -&gt; None:</w:t>
+        <w:br/>
+        <w:t xml:space="preserve">        self.db_path = db_path</w:t>
+        <w:br/>
+        <w:t xml:space="preserve">        self.db_path.parent.mkdir(parents=True, exist_ok=True)</w:t>
+        <w:br/>
+        <w:t xml:space="preserve">        self._init_schema()</w:t>
+        <w:br/>
+        <w:br/>
+        <w:t xml:space="preserve">    def _connect(self) -&gt; sqlite3.Connection:</w:t>
+        <w:br/>
+        <w:t xml:space="preserve">        return sqlite3.connect(self.db_path)</w:t>
+        <w:br/>
+        <w:br/>
+        <w:t xml:space="preserve">    def _init_schema(self) -&gt; None:</w:t>
+        <w:br/>
+        <w:t xml:space="preserve">        with self._connect() as conn:</w:t>
+        <w:br/>
+        <w:t xml:space="preserve">            conn.execute(</w:t>
+        <w:br/>
+        <w:t xml:space="preserve">                """</w:t>
+        <w:br/>
+        <w:t xml:space="preserve">                CREATE TABLE IF NOT EXISTS conversations (</w:t>
+        <w:br/>
+        <w:t xml:space="preserve">                    id INTEGER PRIMARY KEY AUTOINCREMENT,</w:t>
+        <w:br/>
+        <w:t xml:space="preserve">                    customer_id TEXT NOT NULL,</w:t>
+        <w:br/>
+        <w:t xml:space="preserve">                    query TEXT NOT NULL,</w:t>
+        <w:br/>
+        <w:t xml:space="preserve">                    intent TEXT NOT NULL,</w:t>
+        <w:br/>
+        <w:t xml:space="preserve">                    response TEXT NOT NULL,</w:t>
+        <w:br/>
+        <w:t xml:space="preserve">                    created_at TEXT DEFAULT CURRENT_TIMESTAMP</w:t>
+        <w:br/>
+        <w:t xml:space="preserve">                )</w:t>
+        <w:br/>
+        <w:t xml:space="preserve">                """</w:t>
+        <w:br/>
+        <w:t xml:space="preserve">            )</w:t>
+        <w:br/>
+        <w:br/>
+        <w:t xml:space="preserve">    def add(self, customer_id: str, query: str, intent: str, response: str) -&gt; None:</w:t>
+        <w:br/>
+        <w:t xml:space="preserve">        with self._connect() as conn:</w:t>
+        <w:br/>
+        <w:t xml:space="preserve">            conn.execute(</w:t>
+        <w:br/>
+        <w:t xml:space="preserve">                "INSERT INTO conversations (customer_id, query, intent, response) VALUES (?, ?, ?, ?)",</w:t>
+        <w:br/>
+        <w:t xml:space="preserve">                (customer_id, query, intent, response),</w:t>
+        <w:br/>
+        <w:t xml:space="preserve">            )</w:t>
+        <w:br/>
+        <w:br/>
+        <w:t xml:space="preserve">    def history(self, customer_id: str, limit: int = 5) -&gt; list[str]:</w:t>
+        <w:br/>
+        <w:t xml:space="preserve">        with self._connect() as conn:</w:t>
+        <w:br/>
+        <w:t xml:space="preserve">            rows = conn.execute(</w:t>
+        <w:br/>
+        <w:t xml:space="preserve">                """</w:t>
+        <w:br/>
+        <w:t xml:space="preserve">                SELECT query, intent, response</w:t>
+        <w:br/>
+        <w:t xml:space="preserve">                FROM conversations</w:t>
+        <w:br/>
+        <w:t xml:space="preserve">                WHERE customer_id = ?</w:t>
+        <w:br/>
+        <w:t xml:space="preserve">                ORDER BY id DESC</w:t>
+        <w:br/>
+        <w:t xml:space="preserve">                LIMIT ?</w:t>
+        <w:br/>
+        <w:t xml:space="preserve">                """,</w:t>
+        <w:br/>
+        <w:t xml:space="preserve">                (customer_id, limit),</w:t>
+        <w:br/>
+        <w:t xml:space="preserve">            ).fetchall()</w:t>
+        <w:br/>
+        <w:t xml:space="preserve">        return [f"Query: {query} | Issue: {intent} | Response: {response}" for query, intent, response in rows]</w:t>
+        <w:br/>
+        <w:br/>
+        <w:t xml:space="preserve">    def previous_issue(self, customer_id: str) -&gt; str | None:</w:t>
+        <w:br/>
+        <w:t xml:space="preserve">        with self._connect() as conn:</w:t>
+        <w:br/>
+        <w:t xml:space="preserve">            row = conn.execute(</w:t>
+        <w:br/>
+        <w:t xml:space="preserve">                """</w:t>
+        <w:br/>
+        <w:t xml:space="preserve">                SELECT query, intent</w:t>
+        <w:br/>
+        <w:t xml:space="preserve">                FROM conversations</w:t>
+        <w:br/>
+        <w:t xml:space="preserve">                WHERE customer_id = ?</w:t>
+        <w:br/>
+        <w:t xml:space="preserve">                ORDER BY id DESC</w:t>
+        <w:br/>
+        <w:t xml:space="preserve">                LIMIT 1</w:t>
+        <w:br/>
+        <w:t xml:space="preserve">                """,</w:t>
+        <w:br/>
+        <w:t xml:space="preserve">                (customer_id,),</w:t>
+        <w:br/>
+        <w:t xml:space="preserve">            ).fetchone()</w:t>
+        <w:br/>
+        <w:t xml:space="preserve">        if not row:</w:t>
+        <w:br/>
+        <w:t xml:space="preserve">            return None</w:t>
+        <w:br/>
+        <w:t xml:space="preserve">        return f"Your previous support issue was classified as {row[1]}: {row[0]}"</w:t>
+        <w:br/>
+        <w:br/>
+        <w:br/>
+        <w:t>class LocalRAG:</w:t>
+        <w:br/>
+        <w:t xml:space="preserve">    def __init__(self, docs_dir: Path) -&gt; None:</w:t>
+        <w:br/>
+        <w:t xml:space="preserve">        self.documents = []</w:t>
+        <w:br/>
+        <w:t xml:space="preserve">        for path in sorted(docs_dir.glob("*.txt")):</w:t>
+        <w:br/>
+        <w:t xml:space="preserve">            self.documents.append((path.name, path.read_text(encoding="utf-8")))</w:t>
+        <w:br/>
+        <w:br/>
+        <w:t xml:space="preserve">    @staticmethod</w:t>
+        <w:br/>
+        <w:t xml:space="preserve">    def _tokens(text: str) -&gt; set[str]:</w:t>
+        <w:br/>
+        <w:t xml:space="preserve">        return set(re.findall(r"[a-zA-Z]{3,}", text.lower()))</w:t>
+        <w:br/>
+        <w:br/>
+        <w:t xml:space="preserve">    def retrieve(self, query: str, intent: str, limit: int = 2) -&gt; list[RetrievedDocument]:</w:t>
+        <w:br/>
+        <w:t xml:space="preserve">        query_tokens = self._tokens(f"{query} {intent}")</w:t>
+        <w:br/>
+        <w:t xml:space="preserve">        ranked: list[RetrievedDocument] = []</w:t>
+        <w:br/>
+        <w:t xml:space="preserve">        for source, text in self.documents:</w:t>
+        <w:br/>
+        <w:t xml:space="preserve">            score = len(query_tokens &amp; self._tokens(text))</w:t>
+        <w:br/>
+        <w:t xml:space="preserve">            if intent.lower().split()[0] in source.replace("_", " "):</w:t>
+        <w:br/>
+        <w:t xml:space="preserve">                score += 3</w:t>
+        <w:br/>
+        <w:t xml:space="preserve">            ranked.append(RetrievedDocument(source=source, text=text.strip(), score=score))</w:t>
+        <w:br/>
+        <w:t xml:space="preserve">        ranked.sort(key=lambda item: item.score, reverse=True)</w:t>
+        <w:br/>
+        <w:t xml:space="preserve">        return [item for item in ranked[:limit] if item.score &gt; 0]</w:t>
+        <w:br/>
+        <w:br/>
+        <w:br/>
+        <w:t>class CustomerSupportGraph:</w:t>
+        <w:br/>
+        <w:t xml:space="preserve">    def __init__(self, docs_dir: Path, db_path: Path) -&gt; None:</w:t>
+        <w:br/>
+        <w:t xml:space="preserve">        self.memory = SQLiteMemory(db_path)</w:t>
+        <w:br/>
+        <w:t xml:space="preserve">        self.rag = LocalRAG(docs_dir)</w:t>
+        <w:br/>
+        <w:t xml:space="preserve">        self.graph = self._build_graph()</w:t>
+        <w:br/>
+        <w:br/>
+        <w:t xml:space="preserve">    def _build_graph(self):</w:t>
+        <w:br/>
+        <w:t xml:space="preserve">        workflow = StateGraph(SupportState)</w:t>
+        <w:br/>
+        <w:t xml:space="preserve">        workflow.add_node("load_memory", self.load_memory)</w:t>
+        <w:br/>
+        <w:t xml:space="preserve">        workflow.add_node("classify_intent", self.classify_intent)</w:t>
+        <w:br/>
+        <w:t xml:space="preserve">        workflow.add_node("retrieve_context", self.retrieve_context)</w:t>
+        <w:br/>
+        <w:t xml:space="preserve">        workflow.add_node("sales_agent", self.sales_agent)</w:t>
+        <w:br/>
+        <w:t xml:space="preserve">        workflow.add_node("technical_agent", self.technical_agent)</w:t>
+        <w:br/>
+        <w:t xml:space="preserve">        workflow.add_node("billing_agent", self.billing_agent)</w:t>
+        <w:br/>
+        <w:t xml:space="preserve">        workflow.add_node("account_agent", self.account_agent)</w:t>
+        <w:br/>
+        <w:t xml:space="preserve">        workflow.add_node("memory_agent", self.memory_agent)</w:t>
+        <w:br/>
+        <w:t xml:space="preserve">        workflow.add_node("human_approval", self.human_approval)</w:t>
+        <w:br/>
+        <w:t xml:space="preserve">        workflow.add_node("supervisor", self.supervisor)</w:t>
+        <w:br/>
+        <w:t xml:space="preserve">        workflow.add_node("save_memory", self.save_memory)</w:t>
+        <w:br/>
+        <w:br/>
+        <w:t xml:space="preserve">        workflow.set_entry_point("load_memory")</w:t>
+        <w:br/>
+        <w:t xml:space="preserve">        workflow.add_edge("load_memory", "classify_intent")</w:t>
+        <w:br/>
+        <w:t xml:space="preserve">        workflow.add_conditional_edges(</w:t>
+        <w:br/>
+        <w:t xml:space="preserve">            "classify_intent",</w:t>
+        <w:br/>
+        <w:t xml:space="preserve">            self.route_after_classification,</w:t>
+        <w:br/>
+        <w:t xml:space="preserve">            {</w:t>
+        <w:br/>
+        <w:t xml:space="preserve">                "Sales": "retrieve_context",</w:t>
+        <w:br/>
+        <w:t xml:space="preserve">                "Technical Support": "retrieve_context",</w:t>
+        <w:br/>
+        <w:t xml:space="preserve">                "Billing": "retrieve_context",</w:t>
+        <w:br/>
+        <w:t xml:space="preserve">                "Account": "retrieve_context",</w:t>
+        <w:br/>
+        <w:t xml:space="preserve">                "Memory Recall": "memory_agent",</w:t>
+        <w:br/>
+        <w:t xml:space="preserve">            },</w:t>
+        <w:br/>
+        <w:t xml:space="preserve">        )</w:t>
+        <w:br/>
+        <w:t xml:space="preserve">        workflow.add_conditional_edges(</w:t>
+        <w:br/>
+        <w:t xml:space="preserve">            "retrieve_context",</w:t>
+        <w:br/>
+        <w:t xml:space="preserve">            self.route_to_agent,</w:t>
+        <w:br/>
+        <w:t xml:space="preserve">            {</w:t>
+        <w:br/>
+        <w:t xml:space="preserve">                "Sales": "sales_agent",</w:t>
+        <w:br/>
+        <w:t xml:space="preserve">                "Technical Support": "technical_agent",</w:t>
+        <w:br/>
+        <w:t xml:space="preserve">                "Billing": "billing_agent",</w:t>
+        <w:br/>
+        <w:t xml:space="preserve">                "Account": "account_agent",</w:t>
+        <w:br/>
+        <w:t xml:space="preserve">            },</w:t>
+        <w:br/>
+        <w:t xml:space="preserve">        )</w:t>
+        <w:br/>
+        <w:t xml:space="preserve">        for node in ["sales_agent", "technical_agent", "billing_agent", "account_agent"]:</w:t>
+        <w:br/>
+        <w:t xml:space="preserve">            workflow.add_conditional_edges(node, self.route_for_approval, {"approval": "human_approval", "supervisor": "supervisor"})</w:t>
+        <w:br/>
+        <w:t xml:space="preserve">        workflow.add_edge("human_approval", "supervisor")</w:t>
+        <w:br/>
+        <w:t xml:space="preserve">        workflow.add_edge("memory_agent", "save_memory")</w:t>
+        <w:br/>
+        <w:t xml:space="preserve">        workflow.add_edge("supervisor", "save_memory")</w:t>
+        <w:br/>
+        <w:t xml:space="preserve">        workflow.add_edge("save_memory", END)</w:t>
+        <w:br/>
+        <w:t xml:space="preserve">        return workflow.compile()</w:t>
+        <w:br/>
+        <w:br/>
+        <w:t xml:space="preserve">    @staticmethod</w:t>
+        <w:br/>
+        <w:t xml:space="preserve">    def _append_trace(state: SupportState, message: str) -&gt; list[str]:</w:t>
+        <w:br/>
+        <w:t xml:space="preserve">        return [*state.get("trace", []), message]</w:t>
+        <w:br/>
+        <w:br/>
+        <w:t xml:space="preserve">    def load_memory(self, state: SupportState) -&gt; SupportState:</w:t>
+        <w:br/>
+        <w:t xml:space="preserve">        history = self.memory.history(state["customer_id"])</w:t>
+        <w:br/>
+        <w:t xml:space="preserve">        return {**state, "conversation_history": history, "trace": self._append_trace(state, "Loaded SQLite conversation memory")}</w:t>
+        <w:br/>
+        <w:br/>
+        <w:t xml:space="preserve">    def classify_intent(self, state: SupportState) -&gt; SupportState:</w:t>
+        <w:br/>
+        <w:t xml:space="preserve">        query = state["query"].lower()</w:t>
+        <w:br/>
+        <w:t xml:space="preserve">        if any(phrase in query for phrase in ["previous issue", "last issue", "what was my previous"]):</w:t>
+        <w:br/>
+        <w:t xml:space="preserve">            intent: Department = "Memory Recall"</w:t>
+        <w:br/>
+        <w:t xml:space="preserve">        else:</w:t>
+        <w:br/>
+        <w:t xml:space="preserve">            scores = {</w:t>
+        <w:br/>
+        <w:t xml:space="preserve">                department: sum(1 for keyword in keywords if keyword in query)</w:t>
+        <w:br/>
+        <w:t xml:space="preserve">                for department, keywords in DEPARTMENT_KEYWORDS.items()</w:t>
+        <w:br/>
+        <w:t xml:space="preserve">            }</w:t>
+        <w:br/>
+        <w:t xml:space="preserve">            intent = max(scores, key=scores.get)  # type: ignore[assignment]</w:t>
+        <w:br/>
+        <w:t xml:space="preserve">            if scores[intent] == 0:</w:t>
+        <w:br/>
+        <w:t xml:space="preserve">                intent = "Technical Support"</w:t>
+        <w:br/>
+        <w:t xml:space="preserve">        high_risk = any(pattern in query for pattern in HIGH_RISK_PATTERNS)</w:t>
+        <w:br/>
+        <w:t xml:space="preserve">        return {</w:t>
+        <w:br/>
+        <w:t xml:space="preserve">            **state,</w:t>
+        <w:br/>
+        <w:t xml:space="preserve">            "intent": intent,</w:t>
+        <w:br/>
+        <w:t xml:space="preserve">            "routed_department": intent,</w:t>
+        <w:br/>
+        <w:t xml:space="preserve">            "high_risk": high_risk,</w:t>
+        <w:br/>
+        <w:t xml:space="preserve">            "approval_required": high_risk,</w:t>
+        <w:br/>
+        <w:t xml:space="preserve">            "trace": self._append_trace(state, f"Classified intent as {intent}"),</w:t>
+        <w:br/>
+        <w:t xml:space="preserve">        }</w:t>
+        <w:br/>
+        <w:br/>
+        <w:t xml:space="preserve">    @staticmethod</w:t>
+        <w:br/>
+        <w:t xml:space="preserve">    def route_after_classification(state: SupportState) -&gt; str:</w:t>
+        <w:br/>
+        <w:t xml:space="preserve">        return state["intent"]</w:t>
+        <w:br/>
+        <w:br/>
+        <w:t xml:space="preserve">    def retrieve_context(self, state: SupportState) -&gt; SupportState:</w:t>
+        <w:br/>
+        <w:t xml:space="preserve">        docs = self.rag.retrieve(state["query"], state["intent"])</w:t>
+        <w:br/>
+        <w:t xml:space="preserve">        snippets = [f"{doc.source}: {doc.text}" for doc in docs]</w:t>
+        <w:br/>
+        <w:t xml:space="preserve">        return {**state, "retrieved_context": snippets, "trace": self._append_trace(state, "Retrieved RAG context from company documents")}</w:t>
+        <w:br/>
+        <w:br/>
+        <w:t xml:space="preserve">    @staticmethod</w:t>
+        <w:br/>
+        <w:t xml:space="preserve">    def route_to_agent(state: SupportState) -&gt; str:</w:t>
+        <w:br/>
+        <w:t xml:space="preserve">        return state["intent"]</w:t>
+        <w:br/>
+        <w:br/>
+        <w:t xml:space="preserve">    @staticmethod</w:t>
+        <w:br/>
+        <w:t xml:space="preserve">    def _context_summary(state: SupportState) -&gt; str:</w:t>
+        <w:br/>
+        <w:t xml:space="preserve">        context = state.get("retrieved_context", [])</w:t>
+        <w:br/>
+        <w:t xml:space="preserve">        return context[0].split("\n", 1)[0] if context else "No matching company document was found."</w:t>
+        <w:br/>
+        <w:br/>
+        <w:t xml:space="preserve">    def sales_agent(self, state: SupportState) -&gt; SupportState:</w:t>
+        <w:br/>
+        <w:t xml:space="preserve">        response = "Sales Support: ABC Technologies offers Starter, Professional, and Enterprise plans. " + self._context_summary(state)</w:t>
+        <w:br/>
+        <w:t xml:space="preserve">        return {**state, "draft_response": response, "trace": self._append_trace(state, "Sales agent drafted response")}</w:t>
+        <w:br/>
+        <w:br/>
+        <w:t xml:space="preserve">    def technical_agent(self, state: SupportState) -&gt; SupportState:</w:t>
+        <w:br/>
+        <w:t xml:space="preserve">        response = "Technical Support: Please check supported file type, file size, browser version, and blocking extensions. " + self._context_summary(state)</w:t>
+        <w:br/>
+        <w:t xml:space="preserve">        return {**state, "draft_response": response, "trace": self._append_trace(state, "Technical Support agent drafted response")}</w:t>
+        <w:br/>
+        <w:br/>
+        <w:t xml:space="preserve">    def billing_agent(self, state: SupportState) -&gt; SupportState:</w:t>
+        <w:br/>
+        <w:t xml:space="preserve">        response = "Billing Support: I found that your request relates to billing or refund handling. " + self._context_summary(state)</w:t>
+        <w:br/>
+        <w:t xml:space="preserve">        return {**state, "draft_response": response, "trace": self._append_trace(state, "Billing agent drafted response")}</w:t>
+        <w:br/>
+        <w:br/>
+        <w:t xml:space="preserve">    def account_agent(self, state: SupportState) -&gt; SupportState:</w:t>
+        <w:br/>
+        <w:t xml:space="preserve">        response = "Account Support: You can reset your password from the login page by selecting Forgot password. " + self._context_summary(state)</w:t>
+        <w:br/>
+        <w:t xml:space="preserve">        return {**state, "draft_response": response, "trace": self._append_trace(state, "Account agent drafted response")}</w:t>
+        <w:br/>
+        <w:br/>
+        <w:t xml:space="preserve">    @staticmethod</w:t>
+        <w:br/>
+        <w:t xml:space="preserve">    def route_for_approval(state: SupportState) -&gt; str:</w:t>
+        <w:br/>
+        <w:t xml:space="preserve">        return "approval" if state.get("approval_required") else "supervisor"</w:t>
+        <w:br/>
+        <w:br/>
+        <w:t xml:space="preserve">    def human_approval(self, state: SupportState) -&gt; SupportState:</w:t>
+        <w:br/>
+        <w:t xml:space="preserve">        approved = "approved_for_demo"</w:t>
+        <w:br/>
+        <w:t xml:space="preserve">        response = state["draft_response"] + " A human supervisor has reviewed this high-risk request and approved sending this guidance."</w:t>
+        <w:br/>
+        <w:t xml:space="preserve">        return {</w:t>
+        <w:br/>
+        <w:t xml:space="preserve">            **state,</w:t>
+        <w:br/>
+        <w:t xml:space="preserve">            "approval_status": approved,</w:t>
+        <w:br/>
+        <w:t xml:space="preserve">            "draft_response": response,</w:t>
+        <w:br/>
+        <w:t xml:space="preserve">            "trace": self._append_trace(state, "Human supervisor approval completed"),</w:t>
+        <w:br/>
+        <w:t xml:space="preserve">        }</w:t>
+        <w:br/>
+        <w:br/>
+        <w:t xml:space="preserve">    def memory_agent(self, state: SupportState) -&gt; SupportState:</w:t>
+        <w:br/>
+        <w:t xml:space="preserve">        previous = self.memory.previous_issue(state["customer_id"])</w:t>
+        <w:br/>
+        <w:t xml:space="preserve">        response = previous or "I do not have a previous support issue stored for you yet."</w:t>
+        <w:br/>
+        <w:t xml:space="preserve">        return {</w:t>
+        <w:br/>
+        <w:t xml:space="preserve">            **state,</w:t>
+        <w:br/>
+        <w:t xml:space="preserve">            "draft_response": response,</w:t>
+        <w:br/>
+        <w:t xml:space="preserve">            "approval_required": False,</w:t>
+        <w:br/>
+        <w:t xml:space="preserve">            "approval_status": "not_required",</w:t>
+        <w:br/>
+        <w:t xml:space="preserve">            "trace": self._append_trace(state, "Memory recall answered from SQLite"),</w:t>
+        <w:br/>
+        <w:t xml:space="preserve">        }</w:t>
+        <w:br/>
+        <w:br/>
+        <w:t xml:space="preserve">    def supervisor(self, state: SupportState) -&gt; SupportState:</w:t>
+        <w:br/>
+        <w:t xml:space="preserve">        response = state["draft_response"]</w:t>
+        <w:br/>
+        <w:t xml:space="preserve">        if state.get("approval_required") and not state.get("approval_status"):</w:t>
+        <w:br/>
+        <w:t xml:space="preserve">            response += " This request still requires supervisor approval before final processing."</w:t>
+        <w:br/>
+        <w:t xml:space="preserve">        final = response + " Thank you for contacting ABC Technologies."</w:t>
+        <w:br/>
+        <w:t xml:space="preserve">        return {**state, "final_response": final, "trace": self._append_trace(state, "Supervisor validated final response")}</w:t>
+        <w:br/>
+        <w:br/>
+        <w:t xml:space="preserve">    def save_memory(self, state: SupportState) -&gt; SupportState:</w:t>
+        <w:br/>
+        <w:t xml:space="preserve">        final = state.get("final_response") or state.get("draft_response", "")</w:t>
+        <w:br/>
+        <w:t xml:space="preserve">        self.memory.add(state["customer_id"], state["query"], state["intent"], final)</w:t>
+        <w:br/>
+        <w:t xml:space="preserve">        return {**state, "final_response": final, "trace": self._append_trace(state, "Saved interaction to SQLite memory")}</w:t>
+        <w:br/>
+        <w:br/>
+        <w:t xml:space="preserve">    def invoke(self, customer_id: str, query: str) -&gt; SupportState:</w:t>
+        <w:br/>
+        <w:t xml:space="preserve">        return self.graph.invoke({"customer_id": customer_id, "query": query, "trace": []})</w:t>
+      </w:r>
+    </w:p>
+    <w:p>
+      <w:pPr>
+        <w:pStyle w:val="Heading2"/>
+      </w:pPr>
+      <w:r>
+        <w:rPr>
+          <w:color w:val="1F4E79"/>
+        </w:rPr>
+        <w:t>Demo Runner Code</w:t>
+      </w:r>
+    </w:p>
+    <w:p>
+      <w:pPr>
+        <w:spacing w:after="160"/>
+      </w:pPr>
+      <w:r>
+        <w:rPr>
+          <w:rFonts w:ascii="Consolas" w:hAnsi="Consolas"/>
+          <w:sz w:val="16"/>
+        </w:rPr>
+        <w:t>from __future__ import annotations</w:t>
+        <w:br/>
+        <w:br/>
+        <w:t>from pathlib import Path</w:t>
+        <w:br/>
+        <w:br/>
+        <w:t>from support_system import CustomerSupportGraph</w:t>
+        <w:br/>
+        <w:br/>
+        <w:br/>
+        <w:t>ROOT = Path(__file__).resolve().parents[1]</w:t>
+        <w:br/>
+        <w:t>ARTIFACTS = ROOT / "artifacts"</w:t>
+        <w:br/>
+        <w:t>DOCS = ROOT / "data"</w:t>
+        <w:br/>
+        <w:t>DB_PATH = ARTIFACTS / "memory.db"</w:t>
+        <w:br/>
+        <w:br/>
+        <w:br/>
+        <w:t>DEMO_QUERIES = [</w:t>
+        <w:br/>
+        <w:t xml:space="preserve">    "What are the pricing plans available for your software?",</w:t>
+        <w:br/>
+        <w:t xml:space="preserve">    "I forgot my account password.",</w:t>
+        <w:br/>
+        <w:t xml:space="preserve">    "My application crashes whenever I upload a file.",</w:t>
+        <w:br/>
+        <w:t xml:space="preserve">    "I need a refund for my annual subscription.",</w:t>
+        <w:br/>
+        <w:t xml:space="preserve">    "What was my previous support issue?",</w:t>
+        <w:br/>
+        <w:t>]</w:t>
+        <w:br/>
+        <w:br/>
+        <w:br/>
+        <w:t>def main() -&gt; None:</w:t>
+        <w:br/>
+        <w:t xml:space="preserve">    ARTIFACTS.mkdir(parents=True, exist_ok=True)</w:t>
+        <w:br/>
+        <w:t xml:space="preserve">    if DB_PATH.exists():</w:t>
+        <w:br/>
+        <w:t xml:space="preserve">        DB_PATH.unlink()</w:t>
+        <w:br/>
+        <w:br/>
+        <w:t xml:space="preserve">    app = CustomerSupportGraph(docs_dir=DOCS, db_path=DB_PATH)</w:t>
+        <w:br/>
+        <w:t xml:space="preserve">    lines: list[str] = []</w:t>
+        <w:br/>
+        <w:br/>
+        <w:t xml:space="preserve">    for index, query in enumerate(DEMO_QUERIES, start=1):</w:t>
+        <w:br/>
+        <w:t xml:space="preserve">        result = app.invoke(customer_id="customer_david", query=query)</w:t>
+        <w:br/>
+        <w:t xml:space="preserve">        lines.extend(</w:t>
+        <w:br/>
+        <w:t xml:space="preserve">            [</w:t>
+        <w:br/>
+        <w:t xml:space="preserve">                f"Query {index}: {query}",</w:t>
+        <w:br/>
+        <w:t xml:space="preserve">                f"Intent / Route: {result['intent']}",</w:t>
+        <w:br/>
+        <w:t xml:space="preserve">                f"Approval required: {result.get('approval_required', False)}",</w:t>
+        <w:br/>
+        <w:t xml:space="preserve">                f"Approval status: {result.get('approval_status', 'not_required')}",</w:t>
+        <w:br/>
+        <w:t xml:space="preserve">                "Trace:",</w:t>
+        <w:br/>
+        <w:t xml:space="preserve">                *[f"  - {item}" for item in result.get("trace", [])],</w:t>
+        <w:br/>
+        <w:t xml:space="preserve">                "Retrieved context:",</w:t>
+        <w:br/>
+        <w:t xml:space="preserve">                *[f"  - {item.splitlines()[0]}" for item in result.get("retrieved_context", [])],</w:t>
+        <w:br/>
+        <w:t xml:space="preserve">                f"Final response: {result['final_response']}",</w:t>
+        <w:br/>
+        <w:t xml:space="preserve">                "",</w:t>
+        <w:br/>
+        <w:t xml:space="preserve">            ]</w:t>
+        <w:br/>
+        <w:t xml:space="preserve">        )</w:t>
+        <w:br/>
+        <w:br/>
+        <w:t xml:space="preserve">    output = "\n".join(lines)</w:t>
+        <w:br/>
+        <w:t xml:space="preserve">    (ARTIFACTS / "demo_output.txt").write_text(output, encoding="utf-8")</w:t>
+        <w:br/>
+        <w:t xml:space="preserve">    print(output)</w:t>
+        <w:br/>
+        <w:br/>
+        <w:br/>
+        <w:t>if __name__ == "__main__":</w:t>
+        <w:br/>
+        <w:t xml:space="preserve">    main()</w:t>
+      </w:r>
+    </w:p>
+    <w:p>
+      <w:pPr>
+        <w:pStyle w:val="Heading1"/>
+      </w:pPr>
+      <w:r>
+        <w:rPr>
+          <w:color w:val="1F4E79"/>
+        </w:rPr>
         <w:t>Submission Files</w:t>
       </w:r>
     </w:p>

</xml_diff>

<commit_message>
Add screenshot placeholder checklist to report
</commit_message>
<xml_diff>
--- a/docs/ABC_Technologies_Customer_Support_Automation_Report.docx
+++ b/docs/ABC_Technologies_Customer_Support_Automation_Report.docx
@@ -1640,6 +1640,432 @@
         <w:rPr>
           <w:color w:val="1F4E79"/>
         </w:rPr>
+        <w:t>Screenshots to Paste</w:t>
+      </w:r>
+    </w:p>
+    <w:p>
+      <w:r>
+        <w:t>Use these slots for your own terminal screenshots after running python src\run_demo.py. Paste one screenshot per query in the same order as the assignment.</w:t>
+      </w:r>
+    </w:p>
+    <w:p>
+      <w:pPr>
+        <w:pStyle w:val="Heading2"/>
+      </w:pPr>
+      <w:r>
+        <w:rPr>
+          <w:color w:val="1F4E79"/>
+        </w:rPr>
+        <w:t>Query 1 Screenshot - Pricing Plans</w:t>
+      </w:r>
+    </w:p>
+    <w:p>
+      <w:r>
+        <w:t>Expected path: Sales</w:t>
+      </w:r>
+    </w:p>
+    <w:tbl>
+      <w:tblPr>
+        <w:tblStyle w:val="TableGrid"/>
+        <w:tblW w:type="auto" w:w="0"/>
+        <w:tblLook w:firstColumn="1" w:firstRow="1" w:lastColumn="0" w:lastRow="0" w:noHBand="0" w:noVBand="1" w:val="04A0"/>
+      </w:tblPr>
+      <w:tblGrid>
+        <w:gridCol w:w="10080"/>
+      </w:tblGrid>
+      <w:tr>
+        <w:tc>
+          <w:tcPr>
+            <w:tcW w:type="dxa" w:w="10080"/>
+          </w:tcPr>
+          <w:p>
+            <w:pPr>
+              <w:jc w:val="center"/>
+            </w:pPr>
+            <w:r>
+              <w:rPr>
+                <w:b/>
+                <w:sz w:val="28"/>
+              </w:rPr>
+              <w:t>Paste screenshot here</w:t>
+            </w:r>
+          </w:p>
+          <w:p>
+            <w:r>
+              <w:t>Screenshot must show the terminal input and output for this query.</w:t>
+            </w:r>
+          </w:p>
+          <w:p>
+            <w:pPr>
+              <w:pStyle w:val="ListBullet"/>
+            </w:pPr>
+            <w:r>
+              <w:t>Input visible: What are the pricing plans available for your software?</w:t>
+            </w:r>
+          </w:p>
+          <w:p>
+            <w:pPr>
+              <w:pStyle w:val="ListBullet"/>
+            </w:pPr>
+            <w:r>
+              <w:t>Route visible: Sales.</w:t>
+            </w:r>
+          </w:p>
+          <w:p>
+            <w:pPr>
+              <w:pStyle w:val="ListBullet"/>
+            </w:pPr>
+            <w:r>
+              <w:t>Retrieved context visible: Pricing Guide.</w:t>
+            </w:r>
+          </w:p>
+          <w:p>
+            <w:pPr>
+              <w:pStyle w:val="ListBullet"/>
+            </w:pPr>
+            <w:r>
+              <w:t>Final response visible: Starter, Professional, and Enterprise plans.</w:t>
+            </w:r>
+          </w:p>
+        </w:tc>
+      </w:tr>
+    </w:tbl>
+    <w:p>
+      <w:pPr>
+        <w:pStyle w:val="Heading2"/>
+      </w:pPr>
+      <w:r>
+        <w:rPr>
+          <w:color w:val="1F4E79"/>
+        </w:rPr>
+        <w:t>Query 2 Screenshot - Forgot Password</w:t>
+      </w:r>
+    </w:p>
+    <w:p>
+      <w:r>
+        <w:t>Expected path: Account</w:t>
+      </w:r>
+    </w:p>
+    <w:tbl>
+      <w:tblPr>
+        <w:tblStyle w:val="TableGrid"/>
+        <w:tblW w:type="auto" w:w="0"/>
+        <w:tblLook w:firstColumn="1" w:firstRow="1" w:lastColumn="0" w:lastRow="0" w:noHBand="0" w:noVBand="1" w:val="04A0"/>
+      </w:tblPr>
+      <w:tblGrid>
+        <w:gridCol w:w="10080"/>
+      </w:tblGrid>
+      <w:tr>
+        <w:tc>
+          <w:tcPr>
+            <w:tcW w:type="dxa" w:w="10080"/>
+          </w:tcPr>
+          <w:p>
+            <w:pPr>
+              <w:jc w:val="center"/>
+            </w:pPr>
+            <w:r>
+              <w:rPr>
+                <w:b/>
+                <w:sz w:val="28"/>
+              </w:rPr>
+              <w:t>Paste screenshot here</w:t>
+            </w:r>
+          </w:p>
+          <w:p>
+            <w:r>
+              <w:t>Screenshot must show the terminal input and output for this query.</w:t>
+            </w:r>
+          </w:p>
+          <w:p>
+            <w:pPr>
+              <w:pStyle w:val="ListBullet"/>
+            </w:pPr>
+            <w:r>
+              <w:t>Input visible: I forgot my account password.</w:t>
+            </w:r>
+          </w:p>
+          <w:p>
+            <w:pPr>
+              <w:pStyle w:val="ListBullet"/>
+            </w:pPr>
+            <w:r>
+              <w:t>Route visible: Account.</w:t>
+            </w:r>
+          </w:p>
+          <w:p>
+            <w:pPr>
+              <w:pStyle w:val="ListBullet"/>
+            </w:pPr>
+            <w:r>
+              <w:t>Retrieved context visible: FAQ or password reset information.</w:t>
+            </w:r>
+          </w:p>
+          <w:p>
+            <w:pPr>
+              <w:pStyle w:val="ListBullet"/>
+            </w:pPr>
+            <w:r>
+              <w:t>Final response visible: password reset guidance.</w:t>
+            </w:r>
+          </w:p>
+        </w:tc>
+      </w:tr>
+    </w:tbl>
+    <w:p>
+      <w:pPr>
+        <w:pStyle w:val="Heading2"/>
+      </w:pPr>
+      <w:r>
+        <w:rPr>
+          <w:color w:val="1F4E79"/>
+        </w:rPr>
+        <w:t>Query 3 Screenshot - Upload Crash</w:t>
+      </w:r>
+    </w:p>
+    <w:p>
+      <w:r>
+        <w:t>Expected path: Technical Support</w:t>
+      </w:r>
+    </w:p>
+    <w:tbl>
+      <w:tblPr>
+        <w:tblStyle w:val="TableGrid"/>
+        <w:tblW w:type="auto" w:w="0"/>
+        <w:tblLook w:firstColumn="1" w:firstRow="1" w:lastColumn="0" w:lastRow="0" w:noHBand="0" w:noVBand="1" w:val="04A0"/>
+      </w:tblPr>
+      <w:tblGrid>
+        <w:gridCol w:w="10080"/>
+      </w:tblGrid>
+      <w:tr>
+        <w:tc>
+          <w:tcPr>
+            <w:tcW w:type="dxa" w:w="10080"/>
+          </w:tcPr>
+          <w:p>
+            <w:pPr>
+              <w:jc w:val="center"/>
+            </w:pPr>
+            <w:r>
+              <w:rPr>
+                <w:b/>
+                <w:sz w:val="28"/>
+              </w:rPr>
+              <w:t>Paste screenshot here</w:t>
+            </w:r>
+          </w:p>
+          <w:p>
+            <w:r>
+              <w:t>Screenshot must show the terminal input and output for this query.</w:t>
+            </w:r>
+          </w:p>
+          <w:p>
+            <w:pPr>
+              <w:pStyle w:val="ListBullet"/>
+            </w:pPr>
+            <w:r>
+              <w:t>Input visible: My application crashes whenever I upload a file.</w:t>
+            </w:r>
+          </w:p>
+          <w:p>
+            <w:pPr>
+              <w:pStyle w:val="ListBullet"/>
+            </w:pPr>
+            <w:r>
+              <w:t>Route visible: Technical Support.</w:t>
+            </w:r>
+          </w:p>
+          <w:p>
+            <w:pPr>
+              <w:pStyle w:val="ListBullet"/>
+            </w:pPr>
+            <w:r>
+              <w:t>Retrieved context visible: Technical Manual.</w:t>
+            </w:r>
+          </w:p>
+          <w:p>
+            <w:pPr>
+              <w:pStyle w:val="ListBullet"/>
+            </w:pPr>
+            <w:r>
+              <w:t>Final response visible: file type, file size, browser, or extension troubleshooting.</w:t>
+            </w:r>
+          </w:p>
+        </w:tc>
+      </w:tr>
+    </w:tbl>
+    <w:p>
+      <w:pPr>
+        <w:pStyle w:val="Heading2"/>
+      </w:pPr>
+      <w:r>
+        <w:rPr>
+          <w:color w:val="1F4E79"/>
+        </w:rPr>
+        <w:t>Query 4 Screenshot - Refund Request</w:t>
+      </w:r>
+    </w:p>
+    <w:p>
+      <w:r>
+        <w:t>Expected path: Billing with human approval</w:t>
+      </w:r>
+    </w:p>
+    <w:tbl>
+      <w:tblPr>
+        <w:tblStyle w:val="TableGrid"/>
+        <w:tblW w:type="auto" w:w="0"/>
+        <w:tblLook w:firstColumn="1" w:firstRow="1" w:lastColumn="0" w:lastRow="0" w:noHBand="0" w:noVBand="1" w:val="04A0"/>
+      </w:tblPr>
+      <w:tblGrid>
+        <w:gridCol w:w="10080"/>
+      </w:tblGrid>
+      <w:tr>
+        <w:tc>
+          <w:tcPr>
+            <w:tcW w:type="dxa" w:w="10080"/>
+          </w:tcPr>
+          <w:p>
+            <w:pPr>
+              <w:jc w:val="center"/>
+            </w:pPr>
+            <w:r>
+              <w:rPr>
+                <w:b/>
+                <w:sz w:val="28"/>
+              </w:rPr>
+              <w:t>Paste screenshot here</w:t>
+            </w:r>
+          </w:p>
+          <w:p>
+            <w:r>
+              <w:t>Screenshot must show the terminal input and output for this query.</w:t>
+            </w:r>
+          </w:p>
+          <w:p>
+            <w:pPr>
+              <w:pStyle w:val="ListBullet"/>
+            </w:pPr>
+            <w:r>
+              <w:t>Input visible: I need a refund for my annual subscription.</w:t>
+            </w:r>
+          </w:p>
+          <w:p>
+            <w:pPr>
+              <w:pStyle w:val="ListBullet"/>
+            </w:pPr>
+            <w:r>
+              <w:t>Route visible: Billing.</w:t>
+            </w:r>
+          </w:p>
+          <w:p>
+            <w:pPr>
+              <w:pStyle w:val="ListBullet"/>
+            </w:pPr>
+            <w:r>
+              <w:t>Approval visible: approval required is True and supervisor approval is completed.</w:t>
+            </w:r>
+          </w:p>
+          <w:p>
+            <w:pPr>
+              <w:pStyle w:val="ListBullet"/>
+            </w:pPr>
+            <w:r>
+              <w:t>Final response visible: refund or billing response after approval.</w:t>
+            </w:r>
+          </w:p>
+        </w:tc>
+      </w:tr>
+    </w:tbl>
+    <w:p>
+      <w:pPr>
+        <w:pStyle w:val="Heading2"/>
+      </w:pPr>
+      <w:r>
+        <w:rPr>
+          <w:color w:val="1F4E79"/>
+        </w:rPr>
+        <w:t>Query 5 Screenshot - Previous Issue</w:t>
+      </w:r>
+    </w:p>
+    <w:p>
+      <w:r>
+        <w:t>Expected path: Memory Recall</w:t>
+      </w:r>
+    </w:p>
+    <w:tbl>
+      <w:tblPr>
+        <w:tblStyle w:val="TableGrid"/>
+        <w:tblW w:type="auto" w:w="0"/>
+        <w:tblLook w:firstColumn="1" w:firstRow="1" w:lastColumn="0" w:lastRow="0" w:noHBand="0" w:noVBand="1" w:val="04A0"/>
+      </w:tblPr>
+      <w:tblGrid>
+        <w:gridCol w:w="10080"/>
+      </w:tblGrid>
+      <w:tr>
+        <w:tc>
+          <w:tcPr>
+            <w:tcW w:type="dxa" w:w="10080"/>
+          </w:tcPr>
+          <w:p>
+            <w:pPr>
+              <w:jc w:val="center"/>
+            </w:pPr>
+            <w:r>
+              <w:rPr>
+                <w:b/>
+                <w:sz w:val="28"/>
+              </w:rPr>
+              <w:t>Paste screenshot here</w:t>
+            </w:r>
+          </w:p>
+          <w:p>
+            <w:r>
+              <w:t>Screenshot must show the terminal input and output for this query.</w:t>
+            </w:r>
+          </w:p>
+          <w:p>
+            <w:pPr>
+              <w:pStyle w:val="ListBullet"/>
+            </w:pPr>
+            <w:r>
+              <w:t>Input visible: What was my previous support issue?</w:t>
+            </w:r>
+          </w:p>
+          <w:p>
+            <w:pPr>
+              <w:pStyle w:val="ListBullet"/>
+            </w:pPr>
+            <w:r>
+              <w:t>Route visible: Memory Recall.</w:t>
+            </w:r>
+          </w:p>
+          <w:p>
+            <w:pPr>
+              <w:pStyle w:val="ListBullet"/>
+            </w:pPr>
+            <w:r>
+              <w:t>SQLite memory visible: previous Billing refund issue is recalled.</w:t>
+            </w:r>
+          </w:p>
+          <w:p>
+            <w:pPr>
+              <w:pStyle w:val="ListBullet"/>
+            </w:pPr>
+            <w:r>
+              <w:t>Final response visible: previous support issue answer.</w:t>
+            </w:r>
+          </w:p>
+        </w:tc>
+      </w:tr>
+    </w:tbl>
+    <w:p>
+      <w:pPr>
+        <w:pStyle w:val="Heading1"/>
+      </w:pPr>
+      <w:r>
+        <w:rPr>
+          <w:color w:val="1F4E79"/>
+        </w:rPr>
         <w:t>Source Code</w:t>
       </w:r>
     </w:p>

</xml_diff>

<commit_message>
Restyle report with black and white diagram placeholders
</commit_message>
<xml_diff>
--- a/docs/ABC_Technologies_Customer_Support_Automation_Report.docx
+++ b/docs/ABC_Technologies_Customer_Support_Automation_Report.docx
@@ -9,7 +9,7 @@
       <w:r>
         <w:rPr>
           <w:b/>
-          <w:color w:val="1F4E79"/>
+          <w:color w:val="000000"/>
           <w:sz w:val="44"/>
         </w:rPr>
         <w:t>AI-Powered Customer Support Automation System</w:t>
@@ -21,7 +21,7 @@
       </w:pPr>
       <w:r>
         <w:rPr>
-          <w:color w:val="595959"/>
+          <w:color w:val="000000"/>
           <w:sz w:val="24"/>
         </w:rPr>
         <w:t>ABC Technologies | LangGraph Project Documentation</w:t>
@@ -33,9 +33,9 @@
       </w:pPr>
       <w:r>
         <w:rPr>
-          <w:color w:val="1F4E79"/>
+          <w:color w:val="000000"/>
         </w:rPr>
-        <w:t>Project Overview</w:t>
+        <w:t>1. Project Brief</w:t>
       </w:r>
     </w:p>
     <w:p>
@@ -49,9 +49,9 @@
       </w:pPr>
       <w:r>
         <w:rPr>
-          <w:color w:val="1F4E79"/>
+          <w:color w:val="000000"/>
         </w:rPr>
-        <w:t>Business Requirements Covered</w:t>
+        <w:t>2. Requirements Covered</w:t>
       </w:r>
     </w:p>
     <w:p>
@@ -116,9 +116,9 @@
       </w:pPr>
       <w:r>
         <w:rPr>
-          <w:color w:val="1F4E79"/>
+          <w:color w:val="000000"/>
         </w:rPr>
-        <w:t>LangGraph Workflow</w:t>
+        <w:t>3. Workflow Diagram</w:t>
       </w:r>
     </w:p>
     <w:p>
@@ -171,9 +171,9 @@
       </w:pPr>
       <w:r>
         <w:rPr>
-          <w:color w:val="1F4E79"/>
+          <w:color w:val="000000"/>
         </w:rPr>
-        <w:t>State Structure</w:t>
+        <w:t>4. State Structure</w:t>
       </w:r>
     </w:p>
     <w:tbl>
@@ -463,9 +463,9 @@
       </w:pPr>
       <w:r>
         <w:rPr>
-          <w:color w:val="1F4E79"/>
+          <w:color w:val="000000"/>
         </w:rPr>
-        <w:t>Task Coverage</w:t>
+        <w:t>5. Task Coverage</w:t>
       </w:r>
     </w:p>
     <w:tbl>
@@ -970,9 +970,9 @@
       </w:pPr>
       <w:r>
         <w:rPr>
-          <w:color w:val="1F4E79"/>
+          <w:color w:val="000000"/>
         </w:rPr>
-        <w:t>Knowledge Base Documents</w:t>
+        <w:t>6. Knowledge Base Documents</w:t>
       </w:r>
     </w:p>
     <w:p>
@@ -1013,9 +1013,9 @@
       </w:pPr>
       <w:r>
         <w:rPr>
-          <w:color w:val="1F4E79"/>
+          <w:color w:val="000000"/>
         </w:rPr>
-        <w:t>Human-in-the-Loop Approval</w:t>
+        <w:t>7. Human Approval</w:t>
       </w:r>
     </w:p>
     <w:p>
@@ -1029,9 +1029,9 @@
       </w:pPr>
       <w:r>
         <w:rPr>
-          <w:color w:val="1F4E79"/>
+          <w:color w:val="000000"/>
         </w:rPr>
-        <w:t>SQLite Memory</w:t>
+        <w:t>8. SQLite Memory</w:t>
       </w:r>
     </w:p>
     <w:p>
@@ -1045,9 +1045,9 @@
       </w:pPr>
       <w:r>
         <w:rPr>
-          <w:color w:val="1F4E79"/>
+          <w:color w:val="000000"/>
         </w:rPr>
-        <w:t>Demonstration Results</w:t>
+        <w:t>9. Demonstration Results</w:t>
       </w:r>
     </w:p>
     <w:tbl>
@@ -1417,235 +1417,9 @@
       </w:pPr>
       <w:r>
         <w:rPr>
-          <w:color w:val="1F4E79"/>
+          <w:color w:val="000000"/>
         </w:rPr>
-        <w:t>Input and Output Screenshots</w:t>
-      </w:r>
-    </w:p>
-    <w:p>
-      <w:r>
-        <w:t>The following screenshots show the actual demo execution for each required sample query, including input, route, approval status, trace, retrieved context, and final response.</w:t>
-      </w:r>
-    </w:p>
-    <w:p>
-      <w:r>
-        <w:t>Query 1 execution screenshot</w:t>
-      </w:r>
-    </w:p>
-    <w:p>
-      <w:r>
-        <w:drawing>
-          <wp:inline xmlns:a="http://schemas.openxmlformats.org/drawingml/2006/main" xmlns:pic="http://schemas.openxmlformats.org/drawingml/2006/picture">
-            <wp:extent cx="6217920" cy="4352544"/>
-            <wp:docPr id="2" name="Picture 2"/>
-            <wp:cNvGraphicFramePr>
-              <a:graphicFrameLocks noChangeAspect="1"/>
-            </wp:cNvGraphicFramePr>
-            <a:graphic>
-              <a:graphicData uri="http://schemas.openxmlformats.org/drawingml/2006/picture">
-                <pic:pic>
-                  <pic:nvPicPr>
-                    <pic:cNvPr id="0" name="demo_query_1_screenshot.png"/>
-                    <pic:cNvPicPr/>
-                  </pic:nvPicPr>
-                  <pic:blipFill>
-                    <a:blip r:embed="rId10"/>
-                    <a:stretch>
-                      <a:fillRect/>
-                    </a:stretch>
-                  </pic:blipFill>
-                  <pic:spPr>
-                    <a:xfrm>
-                      <a:off x="0" y="0"/>
-                      <a:ext cx="6217920" cy="4352544"/>
-                    </a:xfrm>
-                    <a:prstGeom prst="rect"/>
-                  </pic:spPr>
-                </pic:pic>
-              </a:graphicData>
-            </a:graphic>
-          </wp:inline>
-        </w:drawing>
-      </w:r>
-    </w:p>
-    <w:p>
-      <w:r>
-        <w:t>Query 2 execution screenshot</w:t>
-      </w:r>
-    </w:p>
-    <w:p>
-      <w:r>
-        <w:drawing>
-          <wp:inline xmlns:a="http://schemas.openxmlformats.org/drawingml/2006/main" xmlns:pic="http://schemas.openxmlformats.org/drawingml/2006/picture">
-            <wp:extent cx="6217920" cy="4352544"/>
-            <wp:docPr id="3" name="Picture 3"/>
-            <wp:cNvGraphicFramePr>
-              <a:graphicFrameLocks noChangeAspect="1"/>
-            </wp:cNvGraphicFramePr>
-            <a:graphic>
-              <a:graphicData uri="http://schemas.openxmlformats.org/drawingml/2006/picture">
-                <pic:pic>
-                  <pic:nvPicPr>
-                    <pic:cNvPr id="0" name="demo_query_2_screenshot.png"/>
-                    <pic:cNvPicPr/>
-                  </pic:nvPicPr>
-                  <pic:blipFill>
-                    <a:blip r:embed="rId11"/>
-                    <a:stretch>
-                      <a:fillRect/>
-                    </a:stretch>
-                  </pic:blipFill>
-                  <pic:spPr>
-                    <a:xfrm>
-                      <a:off x="0" y="0"/>
-                      <a:ext cx="6217920" cy="4352544"/>
-                    </a:xfrm>
-                    <a:prstGeom prst="rect"/>
-                  </pic:spPr>
-                </pic:pic>
-              </a:graphicData>
-            </a:graphic>
-          </wp:inline>
-        </w:drawing>
-      </w:r>
-    </w:p>
-    <w:p>
-      <w:r>
-        <w:t>Query 3 execution screenshot</w:t>
-      </w:r>
-    </w:p>
-    <w:p>
-      <w:r>
-        <w:drawing>
-          <wp:inline xmlns:a="http://schemas.openxmlformats.org/drawingml/2006/main" xmlns:pic="http://schemas.openxmlformats.org/drawingml/2006/picture">
-            <wp:extent cx="6217920" cy="4352544"/>
-            <wp:docPr id="4" name="Picture 4"/>
-            <wp:cNvGraphicFramePr>
-              <a:graphicFrameLocks noChangeAspect="1"/>
-            </wp:cNvGraphicFramePr>
-            <a:graphic>
-              <a:graphicData uri="http://schemas.openxmlformats.org/drawingml/2006/picture">
-                <pic:pic>
-                  <pic:nvPicPr>
-                    <pic:cNvPr id="0" name="demo_query_3_screenshot.png"/>
-                    <pic:cNvPicPr/>
-                  </pic:nvPicPr>
-                  <pic:blipFill>
-                    <a:blip r:embed="rId12"/>
-                    <a:stretch>
-                      <a:fillRect/>
-                    </a:stretch>
-                  </pic:blipFill>
-                  <pic:spPr>
-                    <a:xfrm>
-                      <a:off x="0" y="0"/>
-                      <a:ext cx="6217920" cy="4352544"/>
-                    </a:xfrm>
-                    <a:prstGeom prst="rect"/>
-                  </pic:spPr>
-                </pic:pic>
-              </a:graphicData>
-            </a:graphic>
-          </wp:inline>
-        </w:drawing>
-      </w:r>
-    </w:p>
-    <w:p>
-      <w:r>
-        <w:t>Query 4 execution screenshot</w:t>
-      </w:r>
-    </w:p>
-    <w:p>
-      <w:r>
-        <w:drawing>
-          <wp:inline xmlns:a="http://schemas.openxmlformats.org/drawingml/2006/main" xmlns:pic="http://schemas.openxmlformats.org/drawingml/2006/picture">
-            <wp:extent cx="6217920" cy="4352544"/>
-            <wp:docPr id="5" name="Picture 5"/>
-            <wp:cNvGraphicFramePr>
-              <a:graphicFrameLocks noChangeAspect="1"/>
-            </wp:cNvGraphicFramePr>
-            <a:graphic>
-              <a:graphicData uri="http://schemas.openxmlformats.org/drawingml/2006/picture">
-                <pic:pic>
-                  <pic:nvPicPr>
-                    <pic:cNvPr id="0" name="demo_query_4_screenshot.png"/>
-                    <pic:cNvPicPr/>
-                  </pic:nvPicPr>
-                  <pic:blipFill>
-                    <a:blip r:embed="rId13"/>
-                    <a:stretch>
-                      <a:fillRect/>
-                    </a:stretch>
-                  </pic:blipFill>
-                  <pic:spPr>
-                    <a:xfrm>
-                      <a:off x="0" y="0"/>
-                      <a:ext cx="6217920" cy="4352544"/>
-                    </a:xfrm>
-                    <a:prstGeom prst="rect"/>
-                  </pic:spPr>
-                </pic:pic>
-              </a:graphicData>
-            </a:graphic>
-          </wp:inline>
-        </w:drawing>
-      </w:r>
-    </w:p>
-    <w:p>
-      <w:r>
-        <w:t>Query 5 execution screenshot</w:t>
-      </w:r>
-    </w:p>
-    <w:p>
-      <w:r>
-        <w:drawing>
-          <wp:inline xmlns:a="http://schemas.openxmlformats.org/drawingml/2006/main" xmlns:pic="http://schemas.openxmlformats.org/drawingml/2006/picture">
-            <wp:extent cx="6217920" cy="4352544"/>
-            <wp:docPr id="6" name="Picture 6"/>
-            <wp:cNvGraphicFramePr>
-              <a:graphicFrameLocks noChangeAspect="1"/>
-            </wp:cNvGraphicFramePr>
-            <a:graphic>
-              <a:graphicData uri="http://schemas.openxmlformats.org/drawingml/2006/picture">
-                <pic:pic>
-                  <pic:nvPicPr>
-                    <pic:cNvPr id="0" name="demo_query_5_screenshot.png"/>
-                    <pic:cNvPicPr/>
-                  </pic:nvPicPr>
-                  <pic:blipFill>
-                    <a:blip r:embed="rId14"/>
-                    <a:stretch>
-                      <a:fillRect/>
-                    </a:stretch>
-                  </pic:blipFill>
-                  <pic:spPr>
-                    <a:xfrm>
-                      <a:off x="0" y="0"/>
-                      <a:ext cx="6217920" cy="4352544"/>
-                    </a:xfrm>
-                    <a:prstGeom prst="rect"/>
-                  </pic:spPr>
-                </pic:pic>
-              </a:graphicData>
-            </a:graphic>
-          </wp:inline>
-        </w:drawing>
-      </w:r>
-    </w:p>
-    <w:p>
-      <w:pPr>
-        <w:pStyle w:val="Heading1"/>
-      </w:pPr>
-      <w:r>
-        <w:rPr>
-          <w:color w:val="1F4E79"/>
-        </w:rPr>
-        <w:t>Screenshots to Paste</w:t>
-      </w:r>
-    </w:p>
-    <w:p>
-      <w:r>
-        <w:t>Use these slots for your own terminal screenshots after running python src\run_demo.py. Paste one screenshot per query in the same order as the assignment.</w:t>
+        <w:t>10. Screenshots</w:t>
       </w:r>
     </w:p>
     <w:p>
@@ -1654,7 +1428,7 @@
       </w:pPr>
       <w:r>
         <w:rPr>
-          <w:color w:val="1F4E79"/>
+          <w:color w:val="000000"/>
         </w:rPr>
         <w:t>Query 1 Screenshot - Pricing Plans</w:t>
       </w:r>
@@ -1678,55 +1452,15 @@
           <w:tcPr>
             <w:tcW w:type="dxa" w:w="10080"/>
           </w:tcPr>
-          <w:p>
-            <w:pPr>
-              <w:jc w:val="center"/>
-            </w:pPr>
-            <w:r>
-              <w:rPr>
-                <w:b/>
-                <w:sz w:val="28"/>
-              </w:rPr>
-              <w:t>Paste screenshot here</w:t>
-            </w:r>
-          </w:p>
-          <w:p>
-            <w:r>
-              <w:t>Screenshot must show the terminal input and output for this query.</w:t>
-            </w:r>
-          </w:p>
-          <w:p>
-            <w:pPr>
-              <w:pStyle w:val="ListBullet"/>
-            </w:pPr>
-            <w:r>
-              <w:t>Input visible: What are the pricing plans available for your software?</w:t>
-            </w:r>
-          </w:p>
-          <w:p>
-            <w:pPr>
-              <w:pStyle w:val="ListBullet"/>
-            </w:pPr>
-            <w:r>
-              <w:t>Route visible: Sales.</w:t>
-            </w:r>
-          </w:p>
-          <w:p>
-            <w:pPr>
-              <w:pStyle w:val="ListBullet"/>
-            </w:pPr>
-            <w:r>
-              <w:t>Retrieved context visible: Pricing Guide.</w:t>
-            </w:r>
-          </w:p>
-          <w:p>
-            <w:pPr>
-              <w:pStyle w:val="ListBullet"/>
-            </w:pPr>
-            <w:r>
-              <w:t>Final response visible: Starter, Professional, and Enterprise plans.</w:t>
-            </w:r>
-          </w:p>
+          <w:p/>
+          <w:p/>
+          <w:p/>
+          <w:p/>
+          <w:p/>
+          <w:p/>
+          <w:p/>
+          <w:p/>
+          <w:p/>
         </w:tc>
       </w:tr>
     </w:tbl>
@@ -1736,7 +1470,7 @@
       </w:pPr>
       <w:r>
         <w:rPr>
-          <w:color w:val="1F4E79"/>
+          <w:color w:val="000000"/>
         </w:rPr>
         <w:t>Query 2 Screenshot - Forgot Password</w:t>
       </w:r>
@@ -1760,55 +1494,15 @@
           <w:tcPr>
             <w:tcW w:type="dxa" w:w="10080"/>
           </w:tcPr>
-          <w:p>
-            <w:pPr>
-              <w:jc w:val="center"/>
-            </w:pPr>
-            <w:r>
-              <w:rPr>
-                <w:b/>
-                <w:sz w:val="28"/>
-              </w:rPr>
-              <w:t>Paste screenshot here</w:t>
-            </w:r>
-          </w:p>
-          <w:p>
-            <w:r>
-              <w:t>Screenshot must show the terminal input and output for this query.</w:t>
-            </w:r>
-          </w:p>
-          <w:p>
-            <w:pPr>
-              <w:pStyle w:val="ListBullet"/>
-            </w:pPr>
-            <w:r>
-              <w:t>Input visible: I forgot my account password.</w:t>
-            </w:r>
-          </w:p>
-          <w:p>
-            <w:pPr>
-              <w:pStyle w:val="ListBullet"/>
-            </w:pPr>
-            <w:r>
-              <w:t>Route visible: Account.</w:t>
-            </w:r>
-          </w:p>
-          <w:p>
-            <w:pPr>
-              <w:pStyle w:val="ListBullet"/>
-            </w:pPr>
-            <w:r>
-              <w:t>Retrieved context visible: FAQ or password reset information.</w:t>
-            </w:r>
-          </w:p>
-          <w:p>
-            <w:pPr>
-              <w:pStyle w:val="ListBullet"/>
-            </w:pPr>
-            <w:r>
-              <w:t>Final response visible: password reset guidance.</w:t>
-            </w:r>
-          </w:p>
+          <w:p/>
+          <w:p/>
+          <w:p/>
+          <w:p/>
+          <w:p/>
+          <w:p/>
+          <w:p/>
+          <w:p/>
+          <w:p/>
         </w:tc>
       </w:tr>
     </w:tbl>
@@ -1818,7 +1512,7 @@
       </w:pPr>
       <w:r>
         <w:rPr>
-          <w:color w:val="1F4E79"/>
+          <w:color w:val="000000"/>
         </w:rPr>
         <w:t>Query 3 Screenshot - Upload Crash</w:t>
       </w:r>
@@ -1842,55 +1536,15 @@
           <w:tcPr>
             <w:tcW w:type="dxa" w:w="10080"/>
           </w:tcPr>
-          <w:p>
-            <w:pPr>
-              <w:jc w:val="center"/>
-            </w:pPr>
-            <w:r>
-              <w:rPr>
-                <w:b/>
-                <w:sz w:val="28"/>
-              </w:rPr>
-              <w:t>Paste screenshot here</w:t>
-            </w:r>
-          </w:p>
-          <w:p>
-            <w:r>
-              <w:t>Screenshot must show the terminal input and output for this query.</w:t>
-            </w:r>
-          </w:p>
-          <w:p>
-            <w:pPr>
-              <w:pStyle w:val="ListBullet"/>
-            </w:pPr>
-            <w:r>
-              <w:t>Input visible: My application crashes whenever I upload a file.</w:t>
-            </w:r>
-          </w:p>
-          <w:p>
-            <w:pPr>
-              <w:pStyle w:val="ListBullet"/>
-            </w:pPr>
-            <w:r>
-              <w:t>Route visible: Technical Support.</w:t>
-            </w:r>
-          </w:p>
-          <w:p>
-            <w:pPr>
-              <w:pStyle w:val="ListBullet"/>
-            </w:pPr>
-            <w:r>
-              <w:t>Retrieved context visible: Technical Manual.</w:t>
-            </w:r>
-          </w:p>
-          <w:p>
-            <w:pPr>
-              <w:pStyle w:val="ListBullet"/>
-            </w:pPr>
-            <w:r>
-              <w:t>Final response visible: file type, file size, browser, or extension troubleshooting.</w:t>
-            </w:r>
-          </w:p>
+          <w:p/>
+          <w:p/>
+          <w:p/>
+          <w:p/>
+          <w:p/>
+          <w:p/>
+          <w:p/>
+          <w:p/>
+          <w:p/>
         </w:tc>
       </w:tr>
     </w:tbl>
@@ -1900,7 +1554,7 @@
       </w:pPr>
       <w:r>
         <w:rPr>
-          <w:color w:val="1F4E79"/>
+          <w:color w:val="000000"/>
         </w:rPr>
         <w:t>Query 4 Screenshot - Refund Request</w:t>
       </w:r>
@@ -1924,55 +1578,15 @@
           <w:tcPr>
             <w:tcW w:type="dxa" w:w="10080"/>
           </w:tcPr>
-          <w:p>
-            <w:pPr>
-              <w:jc w:val="center"/>
-            </w:pPr>
-            <w:r>
-              <w:rPr>
-                <w:b/>
-                <w:sz w:val="28"/>
-              </w:rPr>
-              <w:t>Paste screenshot here</w:t>
-            </w:r>
-          </w:p>
-          <w:p>
-            <w:r>
-              <w:t>Screenshot must show the terminal input and output for this query.</w:t>
-            </w:r>
-          </w:p>
-          <w:p>
-            <w:pPr>
-              <w:pStyle w:val="ListBullet"/>
-            </w:pPr>
-            <w:r>
-              <w:t>Input visible: I need a refund for my annual subscription.</w:t>
-            </w:r>
-          </w:p>
-          <w:p>
-            <w:pPr>
-              <w:pStyle w:val="ListBullet"/>
-            </w:pPr>
-            <w:r>
-              <w:t>Route visible: Billing.</w:t>
-            </w:r>
-          </w:p>
-          <w:p>
-            <w:pPr>
-              <w:pStyle w:val="ListBullet"/>
-            </w:pPr>
-            <w:r>
-              <w:t>Approval visible: approval required is True and supervisor approval is completed.</w:t>
-            </w:r>
-          </w:p>
-          <w:p>
-            <w:pPr>
-              <w:pStyle w:val="ListBullet"/>
-            </w:pPr>
-            <w:r>
-              <w:t>Final response visible: refund or billing response after approval.</w:t>
-            </w:r>
-          </w:p>
+          <w:p/>
+          <w:p/>
+          <w:p/>
+          <w:p/>
+          <w:p/>
+          <w:p/>
+          <w:p/>
+          <w:p/>
+          <w:p/>
         </w:tc>
       </w:tr>
     </w:tbl>
@@ -1982,7 +1596,7 @@
       </w:pPr>
       <w:r>
         <w:rPr>
-          <w:color w:val="1F4E79"/>
+          <w:color w:val="000000"/>
         </w:rPr>
         <w:t>Query 5 Screenshot - Previous Issue</w:t>
       </w:r>
@@ -2006,55 +1620,15 @@
           <w:tcPr>
             <w:tcW w:type="dxa" w:w="10080"/>
           </w:tcPr>
-          <w:p>
-            <w:pPr>
-              <w:jc w:val="center"/>
-            </w:pPr>
-            <w:r>
-              <w:rPr>
-                <w:b/>
-                <w:sz w:val="28"/>
-              </w:rPr>
-              <w:t>Paste screenshot here</w:t>
-            </w:r>
-          </w:p>
-          <w:p>
-            <w:r>
-              <w:t>Screenshot must show the terminal input and output for this query.</w:t>
-            </w:r>
-          </w:p>
-          <w:p>
-            <w:pPr>
-              <w:pStyle w:val="ListBullet"/>
-            </w:pPr>
-            <w:r>
-              <w:t>Input visible: What was my previous support issue?</w:t>
-            </w:r>
-          </w:p>
-          <w:p>
-            <w:pPr>
-              <w:pStyle w:val="ListBullet"/>
-            </w:pPr>
-            <w:r>
-              <w:t>Route visible: Memory Recall.</w:t>
-            </w:r>
-          </w:p>
-          <w:p>
-            <w:pPr>
-              <w:pStyle w:val="ListBullet"/>
-            </w:pPr>
-            <w:r>
-              <w:t>SQLite memory visible: previous Billing refund issue is recalled.</w:t>
-            </w:r>
-          </w:p>
-          <w:p>
-            <w:pPr>
-              <w:pStyle w:val="ListBullet"/>
-            </w:pPr>
-            <w:r>
-              <w:t>Final response visible: previous support issue answer.</w:t>
-            </w:r>
-          </w:p>
+          <w:p/>
+          <w:p/>
+          <w:p/>
+          <w:p/>
+          <w:p/>
+          <w:p/>
+          <w:p/>
+          <w:p/>
+          <w:p/>
         </w:tc>
       </w:tr>
     </w:tbl>
@@ -2064,9 +1638,9 @@
       </w:pPr>
       <w:r>
         <w:rPr>
-          <w:color w:val="1F4E79"/>
+          <w:color w:val="000000"/>
         </w:rPr>
-        <w:t>Source Code</w:t>
+        <w:t>11. Source Code</w:t>
       </w:r>
     </w:p>
     <w:p>
@@ -2075,7 +1649,7 @@
       </w:pPr>
       <w:r>
         <w:rPr>
-          <w:color w:val="1F4E79"/>
+          <w:color w:val="000000"/>
         </w:rPr>
         <w:t>Main LangGraph Workflow Code</w:t>
       </w:r>
@@ -2646,7 +2220,7 @@
       </w:pPr>
       <w:r>
         <w:rPr>
-          <w:color w:val="1F4E79"/>
+          <w:color w:val="000000"/>
         </w:rPr>
         <w:t>Demo Runner Code</w:t>
       </w:r>
@@ -2762,9 +2336,9 @@
       </w:pPr>
       <w:r>
         <w:rPr>
-          <w:color w:val="1F4E79"/>
+          <w:color w:val="000000"/>
         </w:rPr>
-        <w:t>Submission Files</w:t>
+        <w:t>12. Submission Files</w:t>
       </w:r>
     </w:p>
     <w:p>
@@ -2796,7 +2370,7 @@
         <w:pStyle w:val="ListBullet"/>
       </w:pPr>
       <w:r>
-        <w:t>Screenshots PDF: artifacts/screenshots.pdf.</w:t>
+        <w:t>Screenshot slots: included in Section 10 for manually pasted terminal screenshots.</w:t>
       </w:r>
     </w:p>
     <w:p>

</xml_diff>

<commit_message>
Replace workflow diagram with Mermaid rendering
</commit_message>
<xml_diff>
--- a/docs/ABC_Technologies_Customer_Support_Automation_Report.docx
+++ b/docs/ABC_Technologies_Customer_Support_Automation_Report.docx
@@ -133,7 +133,7 @@
       <w:r>
         <w:drawing>
           <wp:inline xmlns:a="http://schemas.openxmlformats.org/drawingml/2006/main" xmlns:pic="http://schemas.openxmlformats.org/drawingml/2006/picture">
-            <wp:extent cx="6217920" cy="3813658"/>
+            <wp:extent cx="6217920" cy="1208608"/>
             <wp:docPr id="1" name="Picture 1"/>
             <wp:cNvGraphicFramePr>
               <a:graphicFrameLocks noChangeAspect="1"/>
@@ -154,7 +154,7 @@
                   <pic:spPr>
                     <a:xfrm>
                       <a:off x="0" y="0"/>
-                      <a:ext cx="6217920" cy="3813658"/>
+                      <a:ext cx="6217920" cy="1208608"/>
                     </a:xfrm>
                     <a:prstGeom prst="rect"/>
                   </pic:spPr>

</xml_diff>

<commit_message>
Add exact submission checklist to report
</commit_message>
<xml_diff>
--- a/docs/ABC_Technologies_Customer_Support_Automation_Report.docx
+++ b/docs/ABC_Technologies_Customer_Support_Automation_Report.docx
@@ -2389,6 +2389,513 @@
         <w:t>Demo output: artifacts/demo_output.txt.</w:t>
       </w:r>
     </w:p>
+    <w:p>
+      <w:pPr>
+        <w:pStyle w:val="Heading1"/>
+      </w:pPr>
+      <w:r>
+        <w:rPr>
+          <w:color w:val="000000"/>
+        </w:rPr>
+        <w:t>13. Final Submission Checklist</w:t>
+      </w:r>
+    </w:p>
+    <w:tbl>
+      <w:tblPr>
+        <w:tblStyle w:val="TableGrid"/>
+        <w:tblW w:type="auto" w:w="0"/>
+        <w:tblLook w:firstColumn="1" w:firstRow="1" w:lastColumn="0" w:lastRow="0" w:noHBand="0" w:noVBand="1" w:val="04A0"/>
+      </w:tblPr>
+      <w:tblGrid>
+        <w:gridCol w:w="3360"/>
+        <w:gridCol w:w="3360"/>
+        <w:gridCol w:w="3360"/>
+      </w:tblGrid>
+      <w:tr>
+        <w:tc>
+          <w:tcPr>
+            <w:tcW w:type="dxa" w:w="3360"/>
+          </w:tcPr>
+          <w:p>
+            <w:r>
+              <w:rPr>
+                <w:b/>
+                <w:sz w:val="20"/>
+              </w:rPr>
+              <w:t>Required Item</w:t>
+            </w:r>
+          </w:p>
+        </w:tc>
+        <w:tc>
+          <w:tcPr>
+            <w:tcW w:type="dxa" w:w="3360"/>
+          </w:tcPr>
+          <w:p>
+            <w:r>
+              <w:rPr>
+                <w:b/>
+                <w:sz w:val="20"/>
+              </w:rPr>
+              <w:t>Where It Is</w:t>
+            </w:r>
+          </w:p>
+        </w:tc>
+        <w:tc>
+          <w:tcPr>
+            <w:tcW w:type="dxa" w:w="3360"/>
+          </w:tcPr>
+          <w:p>
+            <w:r>
+              <w:rPr>
+                <w:b/>
+                <w:sz w:val="20"/>
+              </w:rPr>
+              <w:t>Status</w:t>
+            </w:r>
+          </w:p>
+        </w:tc>
+      </w:tr>
+      <w:tr>
+        <w:tc>
+          <w:tcPr>
+            <w:tcW w:type="dxa" w:w="3360"/>
+          </w:tcPr>
+          <w:p>
+            <w:r>
+              <w:rPr>
+                <w:b w:val="0"/>
+                <w:sz w:val="20"/>
+              </w:rPr>
+              <w:t>Source Code (.zip)</w:t>
+            </w:r>
+          </w:p>
+        </w:tc>
+        <w:tc>
+          <w:tcPr>
+            <w:tcW w:type="dxa" w:w="3360"/>
+          </w:tcPr>
+          <w:p>
+            <w:r>
+              <w:rPr>
+                <w:b w:val="0"/>
+                <w:sz w:val="20"/>
+              </w:rPr>
+              <w:t>Project ZIP contains src/, data/, docs/, artifacts/, README.md, and requirements.txt.</w:t>
+            </w:r>
+          </w:p>
+        </w:tc>
+        <w:tc>
+          <w:tcPr>
+            <w:tcW w:type="dxa" w:w="3360"/>
+          </w:tcPr>
+          <w:p>
+            <w:r>
+              <w:rPr>
+                <w:b w:val="0"/>
+                <w:sz w:val="20"/>
+              </w:rPr>
+              <w:t>Included</w:t>
+            </w:r>
+          </w:p>
+        </w:tc>
+      </w:tr>
+      <w:tr>
+        <w:tc>
+          <w:tcPr>
+            <w:tcW w:type="dxa" w:w="3360"/>
+          </w:tcPr>
+          <w:p>
+            <w:r>
+              <w:rPr>
+                <w:b w:val="0"/>
+                <w:sz w:val="20"/>
+              </w:rPr>
+              <w:t>README.md</w:t>
+            </w:r>
+          </w:p>
+        </w:tc>
+        <w:tc>
+          <w:tcPr>
+            <w:tcW w:type="dxa" w:w="3360"/>
+          </w:tcPr>
+          <w:p>
+            <w:r>
+              <w:rPr>
+                <w:b w:val="0"/>
+                <w:sz w:val="20"/>
+              </w:rPr>
+              <w:t>README.md contains project description, setup steps, and run command.</w:t>
+            </w:r>
+          </w:p>
+        </w:tc>
+        <w:tc>
+          <w:tcPr>
+            <w:tcW w:type="dxa" w:w="3360"/>
+          </w:tcPr>
+          <w:p>
+            <w:r>
+              <w:rPr>
+                <w:b w:val="0"/>
+                <w:sz w:val="20"/>
+              </w:rPr>
+              <w:t>Included</w:t>
+            </w:r>
+          </w:p>
+        </w:tc>
+      </w:tr>
+      <w:tr>
+        <w:tc>
+          <w:tcPr>
+            <w:tcW w:type="dxa" w:w="3360"/>
+          </w:tcPr>
+          <w:p>
+            <w:r>
+              <w:rPr>
+                <w:b w:val="0"/>
+                <w:sz w:val="20"/>
+              </w:rPr>
+              <w:t>Workflow Diagram</w:t>
+            </w:r>
+          </w:p>
+        </w:tc>
+        <w:tc>
+          <w:tcPr>
+            <w:tcW w:type="dxa" w:w="3360"/>
+          </w:tcPr>
+          <w:p>
+            <w:r>
+              <w:rPr>
+                <w:b w:val="0"/>
+                <w:sz w:val="20"/>
+              </w:rPr>
+              <w:t>artifacts/workflow_diagram.png and artifacts/workflow_diagram.mmd.</w:t>
+            </w:r>
+          </w:p>
+        </w:tc>
+        <w:tc>
+          <w:tcPr>
+            <w:tcW w:type="dxa" w:w="3360"/>
+          </w:tcPr>
+          <w:p>
+            <w:r>
+              <w:rPr>
+                <w:b w:val="0"/>
+                <w:sz w:val="20"/>
+              </w:rPr>
+              <w:t>Included</w:t>
+            </w:r>
+          </w:p>
+        </w:tc>
+      </w:tr>
+      <w:tr>
+        <w:tc>
+          <w:tcPr>
+            <w:tcW w:type="dxa" w:w="3360"/>
+          </w:tcPr>
+          <w:p>
+            <w:r>
+              <w:rPr>
+                <w:b w:val="0"/>
+                <w:sz w:val="20"/>
+              </w:rPr>
+              <w:t>Screenshots PDF</w:t>
+            </w:r>
+          </w:p>
+        </w:tc>
+        <w:tc>
+          <w:tcPr>
+            <w:tcW w:type="dxa" w:w="3360"/>
+          </w:tcPr>
+          <w:p>
+            <w:r>
+              <w:rPr>
+                <w:b w:val="0"/>
+                <w:sz w:val="20"/>
+              </w:rPr>
+              <w:t>Create this after pasting your real execution screenshots into Section 10.</w:t>
+            </w:r>
+          </w:p>
+        </w:tc>
+        <w:tc>
+          <w:tcPr>
+            <w:tcW w:type="dxa" w:w="3360"/>
+          </w:tcPr>
+          <w:p>
+            <w:r>
+              <w:rPr>
+                <w:b w:val="0"/>
+                <w:sz w:val="20"/>
+              </w:rPr>
+              <w:t>Pending real screenshots</w:t>
+            </w:r>
+          </w:p>
+        </w:tc>
+      </w:tr>
+      <w:tr>
+        <w:tc>
+          <w:tcPr>
+            <w:tcW w:type="dxa" w:w="3360"/>
+          </w:tcPr>
+          <w:p>
+            <w:r>
+              <w:rPr>
+                <w:b w:val="0"/>
+                <w:sz w:val="20"/>
+              </w:rPr>
+              <w:t>SQLite Memory File/Schema</w:t>
+            </w:r>
+          </w:p>
+        </w:tc>
+        <w:tc>
+          <w:tcPr>
+            <w:tcW w:type="dxa" w:w="3360"/>
+          </w:tcPr>
+          <w:p>
+            <w:r>
+              <w:rPr>
+                <w:b w:val="0"/>
+                <w:sz w:val="20"/>
+              </w:rPr>
+              <w:t>artifacts/memory.db and artifacts/memory_schema.sql.</w:t>
+            </w:r>
+          </w:p>
+        </w:tc>
+        <w:tc>
+          <w:tcPr>
+            <w:tcW w:type="dxa" w:w="3360"/>
+          </w:tcPr>
+          <w:p>
+            <w:r>
+              <w:rPr>
+                <w:b w:val="0"/>
+                <w:sz w:val="20"/>
+              </w:rPr>
+              <w:t>Included</w:t>
+            </w:r>
+          </w:p>
+        </w:tc>
+      </w:tr>
+      <w:tr>
+        <w:tc>
+          <w:tcPr>
+            <w:tcW w:type="dxa" w:w="3360"/>
+          </w:tcPr>
+          <w:p>
+            <w:r>
+              <w:rPr>
+                <w:b w:val="0"/>
+                <w:sz w:val="20"/>
+              </w:rPr>
+              <w:t>Task Output Screenshot - Agent Routing</w:t>
+            </w:r>
+          </w:p>
+        </w:tc>
+        <w:tc>
+          <w:tcPr>
+            <w:tcW w:type="dxa" w:w="3360"/>
+          </w:tcPr>
+          <w:p>
+            <w:r>
+              <w:rPr>
+                <w:b w:val="0"/>
+                <w:sz w:val="20"/>
+              </w:rPr>
+              <w:t>Section 10, Query 1 to Query 3 screenshot spaces.</w:t>
+            </w:r>
+          </w:p>
+        </w:tc>
+        <w:tc>
+          <w:tcPr>
+            <w:tcW w:type="dxa" w:w="3360"/>
+          </w:tcPr>
+          <w:p>
+            <w:r>
+              <w:rPr>
+                <w:b w:val="0"/>
+                <w:sz w:val="20"/>
+              </w:rPr>
+              <w:t>Blank space provided</w:t>
+            </w:r>
+          </w:p>
+        </w:tc>
+      </w:tr>
+      <w:tr>
+        <w:tc>
+          <w:tcPr>
+            <w:tcW w:type="dxa" w:w="3360"/>
+          </w:tcPr>
+          <w:p>
+            <w:r>
+              <w:rPr>
+                <w:b w:val="0"/>
+                <w:sz w:val="20"/>
+              </w:rPr>
+              <w:t>Task Output Screenshot - Human-in-the-Loop</w:t>
+            </w:r>
+          </w:p>
+        </w:tc>
+        <w:tc>
+          <w:tcPr>
+            <w:tcW w:type="dxa" w:w="3360"/>
+          </w:tcPr>
+          <w:p>
+            <w:r>
+              <w:rPr>
+                <w:b w:val="0"/>
+                <w:sz w:val="20"/>
+              </w:rPr>
+              <w:t>Section 10, Query 4 screenshot space.</w:t>
+            </w:r>
+          </w:p>
+        </w:tc>
+        <w:tc>
+          <w:tcPr>
+            <w:tcW w:type="dxa" w:w="3360"/>
+          </w:tcPr>
+          <w:p>
+            <w:r>
+              <w:rPr>
+                <w:b w:val="0"/>
+                <w:sz w:val="20"/>
+              </w:rPr>
+              <w:t>Blank space provided</w:t>
+            </w:r>
+          </w:p>
+        </w:tc>
+      </w:tr>
+      <w:tr>
+        <w:tc>
+          <w:tcPr>
+            <w:tcW w:type="dxa" w:w="3360"/>
+          </w:tcPr>
+          <w:p>
+            <w:r>
+              <w:rPr>
+                <w:b w:val="0"/>
+                <w:sz w:val="20"/>
+              </w:rPr>
+              <w:t>Task Output Screenshot - RAG Retrieval</w:t>
+            </w:r>
+          </w:p>
+        </w:tc>
+        <w:tc>
+          <w:tcPr>
+            <w:tcW w:type="dxa" w:w="3360"/>
+          </w:tcPr>
+          <w:p>
+            <w:r>
+              <w:rPr>
+                <w:b w:val="0"/>
+                <w:sz w:val="20"/>
+              </w:rPr>
+              <w:t>Section 10 screenshots should show retrieved context lines.</w:t>
+            </w:r>
+          </w:p>
+        </w:tc>
+        <w:tc>
+          <w:tcPr>
+            <w:tcW w:type="dxa" w:w="3360"/>
+          </w:tcPr>
+          <w:p>
+            <w:r>
+              <w:rPr>
+                <w:b w:val="0"/>
+                <w:sz w:val="20"/>
+              </w:rPr>
+              <w:t>Blank space provided</w:t>
+            </w:r>
+          </w:p>
+        </w:tc>
+      </w:tr>
+      <w:tr>
+        <w:tc>
+          <w:tcPr>
+            <w:tcW w:type="dxa" w:w="3360"/>
+          </w:tcPr>
+          <w:p>
+            <w:r>
+              <w:rPr>
+                <w:b w:val="0"/>
+                <w:sz w:val="20"/>
+              </w:rPr>
+              <w:t>Task Output Screenshot - Memory Storage &amp; Recall</w:t>
+            </w:r>
+          </w:p>
+        </w:tc>
+        <w:tc>
+          <w:tcPr>
+            <w:tcW w:type="dxa" w:w="3360"/>
+          </w:tcPr>
+          <w:p>
+            <w:r>
+              <w:rPr>
+                <w:b w:val="0"/>
+                <w:sz w:val="20"/>
+              </w:rPr>
+              <w:t>Section 10, Query 5 screenshot space.</w:t>
+            </w:r>
+          </w:p>
+        </w:tc>
+        <w:tc>
+          <w:tcPr>
+            <w:tcW w:type="dxa" w:w="3360"/>
+          </w:tcPr>
+          <w:p>
+            <w:r>
+              <w:rPr>
+                <w:b w:val="0"/>
+                <w:sz w:val="20"/>
+              </w:rPr>
+              <w:t>Blank space provided</w:t>
+            </w:r>
+          </w:p>
+        </w:tc>
+      </w:tr>
+      <w:tr>
+        <w:tc>
+          <w:tcPr>
+            <w:tcW w:type="dxa" w:w="3360"/>
+          </w:tcPr>
+          <w:p>
+            <w:r>
+              <w:rPr>
+                <w:b w:val="0"/>
+                <w:sz w:val="20"/>
+              </w:rPr>
+              <w:t>Task Output Screenshot - Final Response Generation</w:t>
+            </w:r>
+          </w:p>
+        </w:tc>
+        <w:tc>
+          <w:tcPr>
+            <w:tcW w:type="dxa" w:w="3360"/>
+          </w:tcPr>
+          <w:p>
+            <w:r>
+              <w:rPr>
+                <w:b w:val="0"/>
+                <w:sz w:val="20"/>
+              </w:rPr>
+              <w:t>Section 10 screenshots should show final response lines.</w:t>
+            </w:r>
+          </w:p>
+        </w:tc>
+        <w:tc>
+          <w:tcPr>
+            <w:tcW w:type="dxa" w:w="3360"/>
+          </w:tcPr>
+          <w:p>
+            <w:r>
+              <w:rPr>
+                <w:b w:val="0"/>
+                <w:sz w:val="20"/>
+              </w:rPr>
+              <w:t>Blank space provided</w:t>
+            </w:r>
+          </w:p>
+        </w:tc>
+      </w:tr>
+    </w:tbl>
     <w:sectPr>
       <w:pgSz w:w="12240" w:h="15840"/>
       <w:pgMar w:top="936" w:right="1080" w:bottom="936" w:left="1080" w:header="720" w:footer="720" w:gutter="0"/>

</xml_diff>